<commit_message>
vault backup: 2026-07-16 09:59:02
</commit_message>
<xml_diff>
--- a/03 - Clients/Active Cooking Clients/Macrofood/UAT/16Jul26 Macrofrozen MAIA UAT Signoff Checklist (Reformatted).docx
+++ b/03 - Clients/Active Cooking Clients/Macrofood/UAT/16Jul26 Macrofrozen MAIA UAT Signoff Checklist (Reformatted).docx
@@ -21,10 +21,7 @@
     </w:p>
     <w:p>
       <w:pPr>
-        <w:pBdr>
-          <w:bottom w:val="single" w:color="1F3864" w:sz="12" w:space="10"/>
-        </w:pBdr>
-        <w:spacing w:after="200"/>
+        <w:spacing w:after="100"/>
         <w:jc w:val="center"/>
       </w:pPr>
       <w:r>
@@ -41,12 +38,35 @@
     </w:p>
     <w:p>
       <w:pPr>
+        <w:pBdr>
+          <w:bottom w:val="single" w:color="1F3864" w:sz="12" w:space="10"/>
+        </w:pBdr>
+        <w:spacing w:after="200"/>
+        <w:jc w:val="center"/>
+      </w:pPr>
+      <w:r>
+        <w:rPr>
+          <w:rFonts w:ascii="Arial" w:cs="Arial" w:eastAsia="Arial" w:hAnsi="Arial"/>
+          <w:b/>
+          <w:bCs/>
+          <w:i/>
+          <w:iCs/>
+          <w:color w:val="B7472A"/>
+          <w:sz w:val="19"/>
+          <w:szCs w:val="19"/>
+        </w:rPr>
+        <w:t xml:space="preserve">1st UAT — Partial Sign-Off  (2nd UAT to follow for deferred / out-of-scope items)</w:t>
+      </w:r>
+    </w:p>
+    <w:p>
+      <w:pPr>
         <w:spacing w:after="80"/>
       </w:pPr>
     </w:p>
     <w:tbl>
       <w:tblPr>
         <w:tblW w:type="dxa" w:w="9360"/>
+        <w:jc w:val="center"/>
         <w:tblBorders>
           <w:top w:val="single" w:color="auto" w:sz="4"/>
           <w:left w:val="single" w:color="auto" w:sz="4"/>
@@ -99,7 +119,7 @@
                 <w:sz w:val="18"/>
                 <w:szCs w:val="18"/>
               </w:rPr>
-              <w:t xml:space="preserve">This checklist records User Acceptance Testing sign-off for the MAIA implementation at Macro Frozen Sdn. Bhd., against the signed proposal effective 15 May 2026 and Macro Frozen's current operating model. Section 4 is completed by circling Pass or Fail for each item during the in-person UAT session. The signed and annotated copy serves as the acceptance record. Where the signed proposal and Macro Frozen's current operating model differ, the current operating model prevails for acceptance; this checklist does not expand the signed commercial scope.</w:t>
+              <w:t xml:space="preserve">This checklist records User Acceptance Testing sign-off for the MAIA implementation at Macro Frozen Sdn. Bhd., against the signed proposal effective 15 May 2026 and Macro Frozen's current operating model. Section 4 is completed by circling Pass or Fail for each item during the in-person UAT session. The signed and annotated copy serves as the acceptance record. Where the signed proposal and Macro Frozen's current operating model differ, the current operating model prevails for acceptance; this checklist does not expand the signed commercial scope. This is the 1st UAT session and covers a partial sign-off of the items in Section 4; items deferred or excluded this round (Section 3) and the open decisions in Section 6 will be tested and signed off at a 2nd UAT session.</w:t>
             </w:r>
           </w:p>
         </w:tc>
@@ -129,6 +149,7 @@
     <w:tbl>
       <w:tblPr>
         <w:tblW w:type="dxa" w:w="9360"/>
+        <w:jc w:val="center"/>
         <w:tblBorders>
           <w:top w:val="single" w:color="auto" w:sz="4"/>
           <w:left w:val="single" w:color="auto" w:sz="4"/>
@@ -644,6 +665,7 @@
     <w:tbl>
       <w:tblPr>
         <w:tblW w:type="dxa" w:w="9360"/>
+        <w:jc w:val="center"/>
         <w:tblBorders>
           <w:top w:val="single" w:color="auto" w:sz="4"/>
           <w:left w:val="single" w:color="auto" w:sz="4"/>
@@ -1447,6 +1469,7 @@
     <w:tbl>
       <w:tblPr>
         <w:tblW w:type="dxa" w:w="9360"/>
+        <w:jc w:val="center"/>
         <w:tblBorders>
           <w:top w:val="single" w:color="auto" w:sz="4"/>
           <w:left w:val="single" w:color="auto" w:sz="4"/>
@@ -2029,6 +2052,7 @@
     <w:tbl>
       <w:tblPr>
         <w:tblW w:type="dxa" w:w="9360"/>
+        <w:jc w:val="center"/>
         <w:tblBorders>
           <w:top w:val="single" w:color="auto" w:sz="4"/>
           <w:left w:val="single" w:color="auto" w:sz="4"/>
@@ -2095,6 +2119,7 @@
     <w:tbl>
       <w:tblPr>
         <w:tblW w:type="dxa" w:w="9360"/>
+        <w:jc w:val="center"/>
         <w:tblBorders>
           <w:top w:val="single" w:color="auto" w:sz="4"/>
           <w:left w:val="single" w:color="auto" w:sz="4"/>
@@ -6088,6 +6113,7 @@
     <w:tbl>
       <w:tblPr>
         <w:tblW w:type="dxa" w:w="9360"/>
+        <w:jc w:val="center"/>
         <w:tblBorders>
           <w:top w:val="single" w:color="auto" w:sz="4"/>
           <w:left w:val="single" w:color="auto" w:sz="4"/>
@@ -6717,6 +6743,7 @@
     <w:tbl>
       <w:tblPr>
         <w:tblW w:type="dxa" w:w="9360"/>
+        <w:jc w:val="center"/>
         <w:tblBorders>
           <w:top w:val="single" w:color="auto" w:sz="4"/>
           <w:left w:val="single" w:color="auto" w:sz="4"/>
@@ -7151,6 +7178,7 @@
     <w:tbl>
       <w:tblPr>
         <w:tblW w:type="dxa" w:w="9360"/>
+        <w:jc w:val="center"/>
         <w:tblBorders>
           <w:top w:val="single" w:color="auto" w:sz="4"/>
           <w:left w:val="single" w:color="auto" w:sz="4"/>
@@ -7585,7 +7613,7 @@
           <w:sz w:val="18"/>
           <w:szCs w:val="18"/>
         </w:rPr>
-        <w:t xml:space="preserve">By signing this checklist, Macro Frozen Sdn. Bhd. confirms that the MAIA implementation has been demonstrated and reviewed against the scope in Section 2 and the criteria in Sections 4 and 5.</w:t>
+        <w:t xml:space="preserve">By signing this checklist, Macro Frozen Sdn. Bhd. confirms that the MAIA implementation has been demonstrated and reviewed against the scope in Section 2 and the criteria in Sections 4 and 5, for this 1st UAT session.</w:t>
       </w:r>
     </w:p>
     <w:p>
@@ -7626,6 +7654,31 @@
           <w:sz w:val="18"/>
           <w:szCs w:val="18"/>
         </w:rPr>
+        <w:t xml:space="preserve">Partial sign-off.  </w:t>
+      </w:r>
+      <w:r>
+        <w:rPr>
+          <w:rFonts w:ascii="Arial" w:cs="Arial" w:eastAsia="Arial" w:hAnsi="Arial"/>
+          <w:color w:val="222222"/>
+          <w:sz w:val="18"/>
+          <w:szCs w:val="18"/>
+        </w:rPr>
+        <w:t xml:space="preserve">This is the 1st of two planned UAT sessions. Items out of scope this round (Section 3) and the open decisions in Section 6 are not covered by this sign-off and will be tested and signed off at the 2nd UAT session.</w:t>
+      </w:r>
+    </w:p>
+    <w:p>
+      <w:pPr>
+        <w:spacing w:after="120"/>
+      </w:pPr>
+      <w:r>
+        <w:rPr>
+          <w:rFonts w:ascii="Arial" w:cs="Arial" w:eastAsia="Arial" w:hAnsi="Arial"/>
+          <w:b/>
+          <w:bCs/>
+          <w:color w:val="222222"/>
+          <w:sz w:val="18"/>
+          <w:szCs w:val="18"/>
+        </w:rPr>
         <w:t xml:space="preserve">Commercial milestone.  </w:t>
       </w:r>
       <w:r>
@@ -7635,7 +7688,7 @@
           <w:sz w:val="18"/>
           <w:szCs w:val="18"/>
         </w:rPr>
-        <w:t xml:space="preserve">Where all relevant items are marked Pass and this checklist is signed by the authorised client representative, the UAT acceptance milestone under the signed proposal is treated as achieved.</w:t>
+        <w:t xml:space="preserve">Where all relevant items in this 1st UAT session are marked Pass and this checklist is signed by the authorised client representative, the UAT acceptance milestone under the signed proposal is treated as partially achieved, pending final sign-off at the 2nd UAT session.</w:t>
       </w:r>
     </w:p>
     <w:p>
@@ -7690,7 +7743,7 @@
           <w:sz w:val="18"/>
           <w:szCs w:val="18"/>
         </w:rPr>
-        <w:t xml:space="preserve">[ ]  Accepted — all relevant items marked Pass.</w:t>
+        <w:t xml:space="preserve">[ ]  Accepted — all relevant items marked Pass (1st UAT).</w:t>
       </w:r>
     </w:p>
     <w:p>
@@ -7723,6 +7776,20 @@
     </w:p>
     <w:p>
       <w:pPr>
+        <w:spacing w:after="80"/>
+      </w:pPr>
+      <w:r>
+        <w:rPr>
+          <w:rFonts w:ascii="Arial" w:cs="Arial" w:eastAsia="Arial" w:hAnsi="Arial"/>
+          <w:color w:val="222222"/>
+          <w:sz w:val="18"/>
+          <w:szCs w:val="18"/>
+        </w:rPr>
+        <w:t xml:space="preserve">[ ]  Partial sign-off — 1st UAT accepted as above; 2nd UAT to follow for deferred / out-of-scope items.</w:t>
+      </w:r>
+    </w:p>
+    <w:p>
+      <w:pPr>
         <w:pageBreakBefore/>
         <w:spacing w:after="140" w:before="280"/>
       </w:pPr>
@@ -7741,6 +7808,7 @@
     <w:tbl>
       <w:tblPr>
         <w:tblW w:type="dxa" w:w="9360"/>
+        <w:jc w:val="center"/>
         <w:tblBorders>
           <w:top w:val="single" w:color="auto" w:sz="4"/>
           <w:left w:val="single" w:color="auto" w:sz="4"/>
@@ -7844,12 +7912,12 @@
             </w:tcBorders>
             <w:shd w:fill="E8EEF6" w:color="auto" w:val="clear"/>
             <w:tcMar>
-              <w:top w:type="dxa" w:w="80"/>
-              <w:left w:type="dxa" w:w="120"/>
-              <w:bottom w:type="dxa" w:w="80"/>
-              <w:right w:type="dxa" w:w="120"/>
-            </w:tcMar>
-            <w:vAlign w:val="center"/>
+              <w:top w:type="dxa" w:w="100"/>
+              <w:left w:type="dxa" w:w="120"/>
+              <w:bottom w:type="dxa" w:w="700"/>
+              <w:right w:type="dxa" w:w="120"/>
+            </w:tcMar>
+            <w:vAlign w:val="top"/>
           </w:tcPr>
           <w:p>
             <w:pPr>
@@ -7882,12 +7950,12 @@
             </w:tcBorders>
             <w:shd w:fill="FFFFFF" w:color="auto" w:val="clear"/>
             <w:tcMar>
-              <w:top w:type="dxa" w:w="80"/>
-              <w:left w:type="dxa" w:w="120"/>
-              <w:bottom w:type="dxa" w:w="80"/>
-              <w:right w:type="dxa" w:w="120"/>
-            </w:tcMar>
-            <w:vAlign w:val="center"/>
+              <w:top w:type="dxa" w:w="100"/>
+              <w:left w:type="dxa" w:w="120"/>
+              <w:bottom w:type="dxa" w:w="700"/>
+              <w:right w:type="dxa" w:w="120"/>
+            </w:tcMar>
+            <w:vAlign w:val="top"/>
           </w:tcPr>
           <w:p>
             <w:pPr>
@@ -8153,6 +8221,7 @@
     <w:tbl>
       <w:tblPr>
         <w:tblW w:type="dxa" w:w="9360"/>
+        <w:jc w:val="center"/>
         <w:tblBorders>
           <w:top w:val="single" w:color="auto" w:sz="4"/>
           <w:left w:val="single" w:color="auto" w:sz="4"/>
@@ -8256,12 +8325,12 @@
             </w:tcBorders>
             <w:shd w:fill="E8EEF6" w:color="auto" w:val="clear"/>
             <w:tcMar>
-              <w:top w:type="dxa" w:w="80"/>
-              <w:left w:type="dxa" w:w="120"/>
-              <w:bottom w:type="dxa" w:w="80"/>
-              <w:right w:type="dxa" w:w="120"/>
-            </w:tcMar>
-            <w:vAlign w:val="center"/>
+              <w:top w:type="dxa" w:w="100"/>
+              <w:left w:type="dxa" w:w="120"/>
+              <w:bottom w:type="dxa" w:w="700"/>
+              <w:right w:type="dxa" w:w="120"/>
+            </w:tcMar>
+            <w:vAlign w:val="top"/>
           </w:tcPr>
           <w:p>
             <w:pPr>
@@ -8294,12 +8363,12 @@
             </w:tcBorders>
             <w:shd w:fill="FFFFFF" w:color="auto" w:val="clear"/>
             <w:tcMar>
-              <w:top w:type="dxa" w:w="80"/>
-              <w:left w:type="dxa" w:w="120"/>
-              <w:bottom w:type="dxa" w:w="80"/>
-              <w:right w:type="dxa" w:w="120"/>
-            </w:tcMar>
-            <w:vAlign w:val="center"/>
+              <w:top w:type="dxa" w:w="100"/>
+              <w:left w:type="dxa" w:w="120"/>
+              <w:bottom w:type="dxa" w:w="700"/>
+              <w:right w:type="dxa" w:w="120"/>
+            </w:tcMar>
+            <w:vAlign w:val="top"/>
           </w:tcPr>
           <w:p>
             <w:pPr>
@@ -8395,7 +8464,7 @@
                 <w:sz w:val="18"/>
                 <w:szCs w:val="18"/>
               </w:rPr>
-              <w:t xml:space="preserve">[TO FILL]</w:t>
+              <w:t xml:space="preserve">Krystle Wong</w:t>
             </w:r>
           </w:p>
         </w:tc>
@@ -8473,7 +8542,7 @@
                 <w:sz w:val="18"/>
                 <w:szCs w:val="18"/>
               </w:rPr>
-              <w:t xml:space="preserve">[TO FILL]</w:t>
+              <w:t xml:space="preserve">Co-founder</w:t>
             </w:r>
           </w:p>
         </w:tc>

</xml_diff>